<commit_message>
feat(portfolio): update resume, bio, hero section and tech stack
</commit_message>
<xml_diff>
--- a/public/files/juan-esteban-romo-cv.docx
+++ b/public/files/juan-esteban-romo-cv.docx
@@ -247,7 +247,37 @@
               <w:rPr>
                 <w:rFonts w:ascii="STIX Two Text" w:eastAsia="STIX Two Text" w:hAnsi="STIX Two Text" w:cs="STIX Two Text"/>
               </w:rPr>
-              <w:t>Como ingeniero en sistemas cuento con sólidos conocimientos en análisis, diseño y desarrollo de software, así como en infraestructura de sistemas. Mi enfoque en la resolución de problemas y mi capacidad para comprender las necesidades de los usuarios me permiten desarrollar soluciones. Me integro fácilmente en trabajo colaborativo, aportando mi experiencia y fomentando un ambiente de trabajo productivo para el beneficio de la organización.</w:t>
+              <w:t xml:space="preserve">Como ingeniero en sistemas cuento con sólidos conocimientos en análisis, </w:t>
+            </w:r>
+            <w:r>
+              <w:rPr>
+                <w:rFonts w:ascii="STIX Two Text" w:eastAsia="STIX Two Text" w:hAnsi="STIX Two Text" w:cs="STIX Two Text"/>
+              </w:rPr>
+              <w:t>diseño, arquitectura</w:t>
+            </w:r>
+            <w:r>
+              <w:rPr>
+                <w:rFonts w:ascii="STIX Two Text" w:eastAsia="STIX Two Text" w:hAnsi="STIX Two Text" w:cs="STIX Two Text"/>
+              </w:rPr>
+              <w:t xml:space="preserve"> y desarrollo de software, así mismo en infraestructura de sistemas</w:t>
+            </w:r>
+            <w:r>
+              <w:rPr>
+                <w:rFonts w:ascii="STIX Two Text" w:eastAsia="STIX Two Text" w:hAnsi="STIX Two Text" w:cs="STIX Two Text"/>
+              </w:rPr>
+              <w:t>. Mi enfoque en la resolución de problemas y mi capacidad para comprender las necesidades de los usuarios me permiten desarrollar soluciones</w:t>
+            </w:r>
+            <w:r>
+              <w:rPr>
+                <w:rFonts w:ascii="STIX Two Text" w:eastAsia="STIX Two Text" w:hAnsi="STIX Two Text" w:cs="STIX Two Text"/>
+              </w:rPr>
+              <w:t xml:space="preserve"> confiables y precisas</w:t>
+            </w:r>
+            <w:r>
+              <w:rPr>
+                <w:rFonts w:ascii="STIX Two Text" w:eastAsia="STIX Two Text" w:hAnsi="STIX Two Text" w:cs="STIX Two Text"/>
+              </w:rPr>
+              <w:t>. Me integro fácilmente en trabajo colaborativo, aportando mi experiencia y fomentando un ambiente de trabajo productivo para el beneficio de la organización.</w:t>
             </w:r>
           </w:p>
         </w:tc>
@@ -375,7 +405,19 @@
               <w:rPr>
                 <w:rFonts w:ascii="STIX Two Text" w:eastAsia="STIX Two Text" w:hAnsi="STIX Two Text" w:cs="STIX Two Text"/>
               </w:rPr>
-              <w:t>Ingeniero junior gestión de la demanda</w:t>
+              <w:t>Ingeniero junior gest</w:t>
+            </w:r>
+            <w:r>
+              <w:rPr>
+                <w:rFonts w:ascii="STIX Two Text" w:eastAsia="STIX Two Text" w:hAnsi="STIX Two Text" w:cs="STIX Two Text"/>
+              </w:rPr>
+              <w:t>or</w:t>
+            </w:r>
+            <w:r>
+              <w:rPr>
+                <w:rFonts w:ascii="STIX Two Text" w:eastAsia="STIX Two Text" w:hAnsi="STIX Two Text" w:cs="STIX Two Text"/>
+              </w:rPr>
+              <w:t xml:space="preserve"> de la demanda</w:t>
             </w:r>
           </w:p>
           <w:p>
@@ -410,61 +452,25 @@
               <w:rPr>
                 <w:rFonts w:ascii="STIX Two Text" w:eastAsia="STIX Two Text" w:hAnsi="STIX Two Text" w:cs="STIX Two Text"/>
               </w:rPr>
-              <w:t>Ge</w:t>
-            </w:r>
-            <w:r>
-              <w:rPr>
-                <w:rFonts w:ascii="STIX Two Text" w:eastAsia="STIX Two Text" w:hAnsi="STIX Two Text" w:cs="STIX Two Text"/>
-              </w:rPr>
-              <w:t>renciar</w:t>
-            </w:r>
-            <w:r>
-              <w:rPr>
-                <w:rFonts w:ascii="STIX Two Text" w:eastAsia="STIX Two Text" w:hAnsi="STIX Two Text" w:cs="STIX Two Text"/>
-              </w:rPr>
-              <w:t xml:space="preserve"> </w:t>
-            </w:r>
-            <w:r>
-              <w:rPr>
-                <w:rFonts w:ascii="STIX Two Text" w:eastAsia="STIX Two Text" w:hAnsi="STIX Two Text" w:cs="STIX Two Text"/>
-              </w:rPr>
-              <w:t>la integración de plataforma LMS institucional</w:t>
-            </w:r>
-            <w:r>
-              <w:rPr>
-                <w:rFonts w:ascii="STIX Two Text" w:eastAsia="STIX Two Text" w:hAnsi="STIX Two Text" w:cs="STIX Two Text"/>
-              </w:rPr>
-              <w:t>(BrightSpace)</w:t>
-            </w:r>
-            <w:r>
-              <w:rPr>
-                <w:rFonts w:ascii="STIX Two Text" w:eastAsia="STIX Two Text" w:hAnsi="STIX Two Text" w:cs="STIX Two Text"/>
-              </w:rPr>
-              <w:t xml:space="preserve"> con proveedor de herramienta de contenido educativo</w:t>
-            </w:r>
-            <w:r>
-              <w:rPr>
-                <w:rFonts w:ascii="STIX Two Text" w:eastAsia="STIX Two Text" w:hAnsi="STIX Two Text" w:cs="STIX Two Text"/>
-              </w:rPr>
-              <w:t>(Pearson)</w:t>
-            </w:r>
-            <w:r>
-              <w:rPr>
-                <w:rFonts w:ascii="STIX Two Text" w:eastAsia="STIX Two Text" w:hAnsi="STIX Two Text" w:cs="STIX Two Text"/>
-              </w:rPr>
-              <w:t xml:space="preserve"> para cursos determinados por el Centro de Idiomas con el fin de agilizar el proceso de gestión de </w:t>
-            </w:r>
-            <w:r>
-              <w:rPr>
-                <w:rFonts w:ascii="STIX Two Text" w:eastAsia="STIX Two Text" w:hAnsi="STIX Two Text" w:cs="STIX Two Text"/>
-              </w:rPr>
-              <w:t>estos</w:t>
-            </w:r>
-            <w:r>
-              <w:rPr>
-                <w:rFonts w:ascii="STIX Two Text" w:eastAsia="STIX Two Text" w:hAnsi="STIX Two Text" w:cs="STIX Two Text"/>
-              </w:rPr>
-              <w:t xml:space="preserve"> (Angular &amp; Java-Spring-Boot)</w:t>
+              <w:t xml:space="preserve">Ingeniero de soporte de aplicaciones internas de la institución, mejorando </w:t>
+            </w:r>
+            <w:r>
+              <w:rPr>
+                <w:rFonts w:ascii="STIX Two Text" w:eastAsia="STIX Two Text" w:hAnsi="STIX Two Text" w:cs="STIX Two Text"/>
+              </w:rPr>
+              <w:t>características</w:t>
+            </w:r>
+            <w:r>
+              <w:rPr>
+                <w:rFonts w:ascii="STIX Two Text" w:eastAsia="STIX Two Text" w:hAnsi="STIX Two Text" w:cs="STIX Two Text"/>
+              </w:rPr>
+              <w:t xml:space="preserve"> de sistemas internos mediante la implementación de nuevas funcionalidades</w:t>
+            </w:r>
+            <w:r>
+              <w:rPr>
+                <w:rFonts w:ascii="STIX Two Text" w:eastAsia="STIX Two Text" w:hAnsi="STIX Two Text" w:cs="STIX Two Text"/>
+              </w:rPr>
+              <w:t xml:space="preserve"> o corrección de errores</w:t>
             </w:r>
             <w:r>
               <w:rPr>
@@ -475,48 +481,163 @@
           </w:p>
           <w:p>
             <w:pPr>
+              <w:spacing w:after="60"/>
+              <w:ind w:left="641" w:right="851"/>
+              <w:jc w:val="both"/>
+              <w:rPr>
+                <w:rFonts w:ascii="STIX Two Text" w:eastAsia="STIX Two Text" w:hAnsi="STIX Two Text" w:cs="STIX Two Text"/>
+                <w:b/>
+                <w:bCs/>
+              </w:rPr>
+            </w:pPr>
+          </w:p>
+          <w:p>
+            <w:pPr>
+              <w:spacing w:after="60"/>
+              <w:ind w:left="641" w:right="851"/>
+              <w:jc w:val="both"/>
+              <w:rPr>
+                <w:rFonts w:ascii="STIX Two Text" w:eastAsia="STIX Two Text" w:hAnsi="STIX Two Text" w:cs="STIX Two Text"/>
+                <w:b/>
+                <w:bCs/>
+              </w:rPr>
+            </w:pPr>
+            <w:r>
+              <w:rPr>
+                <w:rFonts w:ascii="STIX Two Text" w:eastAsia="STIX Two Text" w:hAnsi="STIX Two Text" w:cs="STIX Two Text"/>
+                <w:b/>
+                <w:bCs/>
+              </w:rPr>
+              <w:t>Logros.</w:t>
+            </w:r>
+          </w:p>
+          <w:p>
+            <w:pPr>
+              <w:pStyle w:val="Prrafodelista"/>
               <w:numPr>
                 <w:ilvl w:val="0"/>
-                <w:numId w:val="3"/>
+                <w:numId w:val="4"/>
               </w:numPr>
               <w:spacing w:after="60"/>
-              <w:ind w:left="641" w:right="851" w:hanging="357"/>
+              <w:ind w:right="851"/>
               <w:jc w:val="both"/>
               <w:rPr>
                 <w:rFonts w:ascii="STIX Two Text" w:eastAsia="STIX Two Text" w:hAnsi="STIX Two Text" w:cs="STIX Two Text"/>
-              </w:rPr>
-            </w:pPr>
-            <w:r>
-              <w:rPr>
-                <w:rFonts w:ascii="STIX Two Text" w:eastAsia="STIX Two Text" w:hAnsi="STIX Two Text" w:cs="STIX Two Text"/>
-              </w:rPr>
-              <w:t>Desarrollar una aplicación en tecnología Power Platform que permitiera automatizar el proceso de evaluación del periodo de prueba de los colaboradores de la institución.</w:t>
-            </w:r>
-          </w:p>
-          <w:p>
-            <w:pPr>
+                <w:b/>
+                <w:bCs/>
+              </w:rPr>
+            </w:pPr>
+            <w:r>
+              <w:rPr>
+                <w:rFonts w:ascii="STIX Two Text" w:eastAsia="STIX Two Text" w:hAnsi="STIX Two Text" w:cs="STIX Two Text"/>
+              </w:rPr>
+              <w:t xml:space="preserve">Cumplir con los SLA acordados para </w:t>
+            </w:r>
+            <w:r>
+              <w:rPr>
+                <w:rFonts w:ascii="STIX Two Text" w:eastAsia="STIX Two Text" w:hAnsi="STIX Two Text" w:cs="STIX Two Text"/>
+              </w:rPr>
+              <w:t>la resolución de incidencias o solicitudes de servicio reportados por los funcionales administrativos.</w:t>
+            </w:r>
+          </w:p>
+          <w:p>
+            <w:pPr>
+              <w:pStyle w:val="Prrafodelista"/>
               <w:numPr>
                 <w:ilvl w:val="0"/>
-                <w:numId w:val="3"/>
+                <w:numId w:val="4"/>
               </w:numPr>
               <w:spacing w:after="60"/>
-              <w:ind w:left="641" w:right="851" w:hanging="357"/>
+              <w:ind w:right="851"/>
               <w:jc w:val="both"/>
               <w:rPr>
                 <w:rFonts w:ascii="STIX Two Text" w:eastAsia="STIX Two Text" w:hAnsi="STIX Two Text" w:cs="STIX Two Text"/>
-              </w:rPr>
-            </w:pPr>
-            <w:r>
-              <w:rPr>
-                <w:rFonts w:ascii="STIX Two Text" w:eastAsia="STIX Two Text" w:hAnsi="STIX Two Text" w:cs="STIX Two Text"/>
-              </w:rPr>
-              <w:t>Desarrollo de soluciones empresariales en Oracle Apex para procesos específicos de las áreas institucionales</w:t>
-            </w:r>
-            <w:r>
-              <w:rPr>
-                <w:rFonts w:ascii="STIX Two Text" w:eastAsia="STIX Two Text" w:hAnsi="STIX Two Text" w:cs="STIX Two Text"/>
-              </w:rPr>
-              <w:t xml:space="preserve"> y migración de soluciones en Oracle Forms</w:t>
+                <w:b/>
+                <w:bCs/>
+              </w:rPr>
+            </w:pPr>
+            <w:r>
+              <w:rPr>
+                <w:rFonts w:ascii="STIX Two Text" w:eastAsia="STIX Two Text" w:hAnsi="STIX Two Text" w:cs="STIX Two Text"/>
+              </w:rPr>
+              <w:t>Gerenciar la integración de</w:t>
+            </w:r>
+            <w:r>
+              <w:rPr>
+                <w:rFonts w:ascii="STIX Two Text" w:eastAsia="STIX Two Text" w:hAnsi="STIX Two Text" w:cs="STIX Two Text"/>
+              </w:rPr>
+              <w:t xml:space="preserve"> la</w:t>
+            </w:r>
+            <w:r>
+              <w:rPr>
+                <w:rFonts w:ascii="STIX Two Text" w:eastAsia="STIX Two Text" w:hAnsi="STIX Two Text" w:cs="STIX Two Text"/>
+              </w:rPr>
+              <w:t xml:space="preserve"> plataforma LMS institucional</w:t>
+            </w:r>
+            <w:r>
+              <w:rPr>
+                <w:rFonts w:ascii="STIX Two Text" w:eastAsia="STIX Two Text" w:hAnsi="STIX Two Text" w:cs="STIX Two Text"/>
+              </w:rPr>
+              <w:t xml:space="preserve"> </w:t>
+            </w:r>
+            <w:r>
+              <w:rPr>
+                <w:rFonts w:ascii="STIX Two Text" w:eastAsia="STIX Two Text" w:hAnsi="STIX Two Text" w:cs="STIX Two Text"/>
+              </w:rPr>
+              <w:t>con proveedor de herramienta de contenido educativo</w:t>
+            </w:r>
+            <w:r>
+              <w:rPr>
+                <w:rFonts w:ascii="STIX Two Text" w:eastAsia="STIX Two Text" w:hAnsi="STIX Two Text" w:cs="STIX Two Text"/>
+              </w:rPr>
+              <w:t xml:space="preserve"> </w:t>
+            </w:r>
+            <w:r>
+              <w:rPr>
+                <w:rFonts w:ascii="STIX Two Text" w:eastAsia="STIX Two Text" w:hAnsi="STIX Two Text" w:cs="STIX Two Text"/>
+              </w:rPr>
+              <w:t>con el fin de agilizar el proceso de gestión</w:t>
+            </w:r>
+            <w:r>
+              <w:rPr>
+                <w:rFonts w:ascii="STIX Two Text" w:eastAsia="STIX Two Text" w:hAnsi="STIX Two Text" w:cs="STIX Two Text"/>
+              </w:rPr>
+              <w:t xml:space="preserve"> de los cursos que utilicen este insumo.</w:t>
+            </w:r>
+          </w:p>
+          <w:p>
+            <w:pPr>
+              <w:pStyle w:val="Prrafodelista"/>
+              <w:numPr>
+                <w:ilvl w:val="0"/>
+                <w:numId w:val="4"/>
+              </w:numPr>
+              <w:spacing w:after="60"/>
+              <w:ind w:right="851"/>
+              <w:jc w:val="both"/>
+              <w:rPr>
+                <w:rFonts w:ascii="STIX Two Text" w:eastAsia="STIX Two Text" w:hAnsi="STIX Two Text" w:cs="STIX Two Text"/>
+                <w:b/>
+                <w:bCs/>
+              </w:rPr>
+            </w:pPr>
+            <w:r>
+              <w:rPr>
+                <w:rFonts w:ascii="STIX Two Text" w:eastAsia="STIX Two Text" w:hAnsi="STIX Two Text" w:cs="STIX Two Text"/>
+              </w:rPr>
+              <w:t xml:space="preserve">Implementar </w:t>
+            </w:r>
+            <w:r>
+              <w:rPr>
+                <w:rFonts w:ascii="STIX Two Text" w:eastAsia="STIX Two Text" w:hAnsi="STIX Two Text" w:cs="STIX Two Text"/>
+              </w:rPr>
+              <w:t>una solución que</w:t>
+            </w:r>
+            <w:r>
+              <w:rPr>
+                <w:rFonts w:ascii="STIX Two Text" w:eastAsia="STIX Two Text" w:hAnsi="STIX Two Text" w:cs="STIX Two Text"/>
+              </w:rPr>
+              <w:t xml:space="preserve"> permitiera automatizar el proceso de evaluación del periodo de prueba de los colaboradores de la institución</w:t>
             </w:r>
             <w:r>
               <w:rPr>
@@ -527,16 +648,11 @@
           </w:p>
           <w:p>
             <w:pPr>
-              <w:pBdr>
-                <w:top w:val="nil"/>
-                <w:left w:val="nil"/>
-                <w:bottom w:val="nil"/>
-                <w:right w:val="nil"/>
-                <w:between w:val="nil"/>
-              </w:pBdr>
-              <w:rPr>
-                <w:rFonts w:ascii="STIX Two Text" w:eastAsia="STIX Two Text" w:hAnsi="STIX Two Text" w:cs="STIX Two Text"/>
-                <w:b/>
+              <w:spacing w:after="60"/>
+              <w:ind w:right="851"/>
+              <w:jc w:val="both"/>
+              <w:rPr>
+                <w:rFonts w:ascii="STIX Two Text" w:eastAsia="STIX Two Text" w:hAnsi="STIX Two Text" w:cs="STIX Two Text"/>
               </w:rPr>
             </w:pPr>
           </w:p>
@@ -710,180 +826,334 @@
                 <w:right w:val="nil"/>
                 <w:between w:val="nil"/>
               </w:pBdr>
+              <w:rPr>
+                <w:rFonts w:ascii="STIX Two Text" w:eastAsia="STIX Two Text" w:hAnsi="STIX Two Text" w:cs="STIX Two Text"/>
+                <w:b/>
+              </w:rPr>
+            </w:pPr>
+          </w:p>
+          <w:p>
+            <w:pPr>
+              <w:pBdr>
+                <w:top w:val="nil"/>
+                <w:left w:val="nil"/>
+                <w:bottom w:val="nil"/>
+                <w:right w:val="nil"/>
+                <w:between w:val="nil"/>
+              </w:pBdr>
+              <w:rPr>
+                <w:rFonts w:ascii="STIX Two Text" w:eastAsia="STIX Two Text" w:hAnsi="STIX Two Text" w:cs="STIX Two Text"/>
+                <w:b/>
+              </w:rPr>
+            </w:pPr>
+          </w:p>
+          <w:p>
+            <w:pPr>
+              <w:pBdr>
+                <w:top w:val="nil"/>
+                <w:left w:val="nil"/>
+                <w:bottom w:val="nil"/>
+                <w:right w:val="nil"/>
+                <w:between w:val="nil"/>
+              </w:pBdr>
+              <w:rPr>
+                <w:rFonts w:ascii="STIX Two Text" w:eastAsia="STIX Two Text" w:hAnsi="STIX Two Text" w:cs="STIX Two Text"/>
+                <w:b/>
+              </w:rPr>
+            </w:pPr>
+          </w:p>
+          <w:p>
+            <w:pPr>
+              <w:pBdr>
+                <w:top w:val="nil"/>
+                <w:left w:val="nil"/>
+                <w:bottom w:val="nil"/>
+                <w:right w:val="nil"/>
+                <w:between w:val="nil"/>
+              </w:pBdr>
+              <w:rPr>
+                <w:rFonts w:ascii="STIX Two Text" w:eastAsia="STIX Two Text" w:hAnsi="STIX Two Text" w:cs="STIX Two Text"/>
+                <w:b/>
+              </w:rPr>
+            </w:pPr>
+          </w:p>
+          <w:p>
+            <w:pPr>
+              <w:pBdr>
+                <w:top w:val="nil"/>
+                <w:left w:val="nil"/>
+                <w:bottom w:val="nil"/>
+                <w:right w:val="nil"/>
+                <w:between w:val="nil"/>
+              </w:pBdr>
+              <w:rPr>
+                <w:rFonts w:ascii="STIX Two Text" w:eastAsia="STIX Two Text" w:hAnsi="STIX Two Text" w:cs="STIX Two Text"/>
+                <w:b/>
+              </w:rPr>
+            </w:pPr>
+          </w:p>
+          <w:p>
+            <w:pPr>
+              <w:pBdr>
+                <w:top w:val="nil"/>
+                <w:left w:val="nil"/>
+                <w:bottom w:val="nil"/>
+                <w:right w:val="nil"/>
+                <w:between w:val="nil"/>
+              </w:pBdr>
+              <w:rPr>
+                <w:rFonts w:ascii="STIX Two Text" w:eastAsia="STIX Two Text" w:hAnsi="STIX Two Text" w:cs="STIX Two Text"/>
+                <w:b/>
+              </w:rPr>
+            </w:pPr>
+          </w:p>
+          <w:p>
+            <w:pPr>
+              <w:pBdr>
+                <w:top w:val="nil"/>
+                <w:left w:val="nil"/>
+                <w:bottom w:val="nil"/>
+                <w:right w:val="nil"/>
+                <w:between w:val="nil"/>
+              </w:pBdr>
+              <w:rPr>
+                <w:rFonts w:ascii="STIX Two Text" w:eastAsia="STIX Two Text" w:hAnsi="STIX Two Text" w:cs="STIX Two Text"/>
+                <w:b/>
+              </w:rPr>
+            </w:pPr>
+          </w:p>
+          <w:p>
+            <w:pPr>
+              <w:pBdr>
+                <w:top w:val="nil"/>
+                <w:left w:val="nil"/>
+                <w:bottom w:val="nil"/>
+                <w:right w:val="nil"/>
+                <w:between w:val="nil"/>
+              </w:pBdr>
+              <w:rPr>
+                <w:rFonts w:ascii="STIX Two Text" w:eastAsia="STIX Two Text" w:hAnsi="STIX Two Text" w:cs="STIX Two Text"/>
+                <w:b/>
+              </w:rPr>
+            </w:pPr>
+          </w:p>
+          <w:p>
+            <w:pPr>
+              <w:pBdr>
+                <w:top w:val="nil"/>
+                <w:left w:val="nil"/>
+                <w:bottom w:val="nil"/>
+                <w:right w:val="nil"/>
+                <w:between w:val="nil"/>
+              </w:pBdr>
+              <w:rPr>
+                <w:rFonts w:ascii="STIX Two Text" w:eastAsia="STIX Two Text" w:hAnsi="STIX Two Text" w:cs="STIX Two Text"/>
+                <w:b/>
+              </w:rPr>
+            </w:pPr>
+          </w:p>
+          <w:p>
+            <w:pPr>
+              <w:pBdr>
+                <w:top w:val="nil"/>
+                <w:left w:val="nil"/>
+                <w:bottom w:val="nil"/>
+                <w:right w:val="nil"/>
+                <w:between w:val="nil"/>
+              </w:pBdr>
+              <w:rPr>
+                <w:rFonts w:ascii="STIX Two Text" w:eastAsia="STIX Two Text" w:hAnsi="STIX Two Text" w:cs="STIX Two Text"/>
+                <w:b/>
+              </w:rPr>
+            </w:pPr>
+          </w:p>
+          <w:p>
+            <w:pPr>
+              <w:pBdr>
+                <w:top w:val="nil"/>
+                <w:left w:val="nil"/>
+                <w:bottom w:val="nil"/>
+                <w:right w:val="nil"/>
+                <w:between w:val="nil"/>
+              </w:pBdr>
+              <w:jc w:val="center"/>
+              <w:rPr>
+                <w:rFonts w:ascii="STIX Two Text" w:eastAsia="STIX Two Text" w:hAnsi="STIX Two Text" w:cs="STIX Two Text"/>
+                <w:b/>
+              </w:rPr>
+            </w:pPr>
+          </w:p>
+          <w:p>
+            <w:pPr>
+              <w:pBdr>
+                <w:top w:val="nil"/>
+                <w:left w:val="nil"/>
+                <w:bottom w:val="nil"/>
+                <w:right w:val="nil"/>
+                <w:between w:val="nil"/>
+              </w:pBdr>
+              <w:jc w:val="center"/>
+              <w:rPr>
+                <w:rFonts w:ascii="STIX Two Text" w:eastAsia="STIX Two Text" w:hAnsi="STIX Two Text" w:cs="STIX Two Text"/>
+                <w:b/>
+              </w:rPr>
+            </w:pPr>
+          </w:p>
+          <w:p>
+            <w:pPr>
+              <w:pBdr>
+                <w:top w:val="nil"/>
+                <w:left w:val="nil"/>
+                <w:bottom w:val="nil"/>
+                <w:right w:val="nil"/>
+                <w:between w:val="nil"/>
+              </w:pBdr>
+              <w:jc w:val="center"/>
+              <w:rPr>
+                <w:rFonts w:ascii="STIX Two Text" w:eastAsia="STIX Two Text" w:hAnsi="STIX Two Text" w:cs="STIX Two Text"/>
+                <w:b/>
+              </w:rPr>
+            </w:pPr>
+          </w:p>
+          <w:p>
+            <w:pPr>
+              <w:pBdr>
+                <w:top w:val="nil"/>
+                <w:left w:val="nil"/>
+                <w:bottom w:val="nil"/>
+                <w:right w:val="nil"/>
+                <w:between w:val="nil"/>
+              </w:pBdr>
+              <w:jc w:val="center"/>
+              <w:rPr>
+                <w:rFonts w:ascii="STIX Two Text" w:eastAsia="STIX Two Text" w:hAnsi="STIX Two Text" w:cs="STIX Two Text"/>
+                <w:b/>
+              </w:rPr>
+            </w:pPr>
+          </w:p>
+          <w:p>
+            <w:pPr>
+              <w:pBdr>
+                <w:top w:val="nil"/>
+                <w:left w:val="nil"/>
+                <w:bottom w:val="nil"/>
+                <w:right w:val="nil"/>
+                <w:between w:val="nil"/>
+              </w:pBdr>
+              <w:jc w:val="center"/>
+              <w:rPr>
+                <w:rFonts w:ascii="STIX Two Text" w:eastAsia="STIX Two Text" w:hAnsi="STIX Two Text" w:cs="STIX Two Text"/>
+                <w:b/>
+              </w:rPr>
+            </w:pPr>
+          </w:p>
+          <w:p>
+            <w:pPr>
+              <w:pBdr>
+                <w:top w:val="nil"/>
+                <w:left w:val="nil"/>
+                <w:bottom w:val="nil"/>
+                <w:right w:val="nil"/>
+                <w:between w:val="nil"/>
+              </w:pBdr>
+              <w:jc w:val="center"/>
+              <w:rPr>
+                <w:rFonts w:ascii="STIX Two Text" w:eastAsia="STIX Two Text" w:hAnsi="STIX Two Text" w:cs="STIX Two Text"/>
+                <w:b/>
+              </w:rPr>
+            </w:pPr>
+          </w:p>
+          <w:p>
+            <w:pPr>
+              <w:pBdr>
+                <w:top w:val="nil"/>
+                <w:left w:val="nil"/>
+                <w:bottom w:val="nil"/>
+                <w:right w:val="nil"/>
+                <w:between w:val="nil"/>
+              </w:pBdr>
+              <w:jc w:val="center"/>
+              <w:rPr>
+                <w:rFonts w:ascii="STIX Two Text" w:eastAsia="STIX Two Text" w:hAnsi="STIX Two Text" w:cs="STIX Two Text"/>
+                <w:i/>
+                <w:color w:val="000000"/>
+              </w:rPr>
+            </w:pPr>
+            <w:r>
+              <w:rPr>
+                <w:rFonts w:ascii="STIX Two Text" w:eastAsia="STIX Two Text" w:hAnsi="STIX Two Text" w:cs="STIX Two Text"/>
+                <w:b/>
+              </w:rPr>
+              <w:t>Cali</w:t>
+            </w:r>
+            <w:r>
+              <w:rPr>
+                <w:rFonts w:ascii="STIX Two Text" w:eastAsia="STIX Two Text" w:hAnsi="STIX Two Text" w:cs="STIX Two Text"/>
+                <w:b/>
+                <w:color w:val="000000"/>
+              </w:rPr>
+              <w:t xml:space="preserve">, </w:t>
+            </w:r>
+            <w:r>
+              <w:rPr>
+                <w:rFonts w:ascii="STIX Two Text" w:eastAsia="STIX Two Text" w:hAnsi="STIX Two Text" w:cs="STIX Two Text"/>
+                <w:b/>
+              </w:rPr>
+              <w:t>Colombia</w:t>
+            </w:r>
+            <w:r>
+              <w:rPr>
+                <w:rFonts w:ascii="STIX Two Text" w:eastAsia="STIX Two Text" w:hAnsi="STIX Two Text" w:cs="STIX Two Text"/>
+                <w:i/>
+                <w:color w:val="000000"/>
+              </w:rPr>
+              <w:t xml:space="preserve"> </w:t>
+            </w:r>
+          </w:p>
+          <w:p>
+            <w:pPr>
+              <w:pBdr>
+                <w:top w:val="nil"/>
+                <w:left w:val="nil"/>
+                <w:bottom w:val="nil"/>
+                <w:right w:val="nil"/>
+                <w:between w:val="nil"/>
+              </w:pBdr>
               <w:jc w:val="right"/>
               <w:rPr>
                 <w:rFonts w:ascii="STIX Two Text" w:eastAsia="STIX Two Text" w:hAnsi="STIX Two Text" w:cs="STIX Two Text"/>
-                <w:b/>
-              </w:rPr>
-            </w:pPr>
-          </w:p>
-          <w:p>
-            <w:pPr>
-              <w:pBdr>
-                <w:top w:val="nil"/>
-                <w:left w:val="nil"/>
-                <w:bottom w:val="nil"/>
-                <w:right w:val="nil"/>
-                <w:between w:val="nil"/>
-              </w:pBdr>
-              <w:jc w:val="right"/>
-              <w:rPr>
-                <w:rFonts w:ascii="STIX Two Text" w:eastAsia="STIX Two Text" w:hAnsi="STIX Two Text" w:cs="STIX Two Text"/>
-                <w:b/>
-              </w:rPr>
-            </w:pPr>
-          </w:p>
-          <w:p>
-            <w:pPr>
-              <w:pBdr>
-                <w:top w:val="nil"/>
-                <w:left w:val="nil"/>
-                <w:bottom w:val="nil"/>
-                <w:right w:val="nil"/>
-                <w:between w:val="nil"/>
-              </w:pBdr>
-              <w:rPr>
-                <w:rFonts w:ascii="STIX Two Text" w:eastAsia="STIX Two Text" w:hAnsi="STIX Two Text" w:cs="STIX Two Text"/>
-                <w:b/>
-              </w:rPr>
-            </w:pPr>
-          </w:p>
-          <w:p>
-            <w:pPr>
-              <w:pBdr>
-                <w:top w:val="nil"/>
-                <w:left w:val="nil"/>
-                <w:bottom w:val="nil"/>
-                <w:right w:val="nil"/>
-                <w:between w:val="nil"/>
-              </w:pBdr>
-              <w:rPr>
-                <w:rFonts w:ascii="STIX Two Text" w:eastAsia="STIX Two Text" w:hAnsi="STIX Two Text" w:cs="STIX Two Text"/>
-                <w:b/>
-              </w:rPr>
-            </w:pPr>
-          </w:p>
-          <w:p>
-            <w:pPr>
-              <w:pBdr>
-                <w:top w:val="nil"/>
-                <w:left w:val="nil"/>
-                <w:bottom w:val="nil"/>
-                <w:right w:val="nil"/>
-                <w:between w:val="nil"/>
-              </w:pBdr>
-              <w:rPr>
-                <w:rFonts w:ascii="STIX Two Text" w:eastAsia="STIX Two Text" w:hAnsi="STIX Two Text" w:cs="STIX Two Text"/>
-                <w:b/>
-              </w:rPr>
-            </w:pPr>
-          </w:p>
-          <w:p>
-            <w:pPr>
-              <w:pBdr>
-                <w:top w:val="nil"/>
-                <w:left w:val="nil"/>
-                <w:bottom w:val="nil"/>
-                <w:right w:val="nil"/>
-                <w:between w:val="nil"/>
-              </w:pBdr>
-              <w:rPr>
-                <w:rFonts w:ascii="STIX Two Text" w:eastAsia="STIX Two Text" w:hAnsi="STIX Two Text" w:cs="STIX Two Text"/>
-                <w:b/>
-              </w:rPr>
-            </w:pPr>
-          </w:p>
-          <w:p>
-            <w:pPr>
-              <w:pBdr>
-                <w:top w:val="nil"/>
-                <w:left w:val="nil"/>
-                <w:bottom w:val="nil"/>
-                <w:right w:val="nil"/>
-                <w:between w:val="nil"/>
-              </w:pBdr>
-              <w:rPr>
-                <w:rFonts w:ascii="STIX Two Text" w:eastAsia="STIX Two Text" w:hAnsi="STIX Two Text" w:cs="STIX Two Text"/>
-                <w:b/>
-              </w:rPr>
-            </w:pPr>
-          </w:p>
-          <w:p>
-            <w:pPr>
-              <w:pBdr>
-                <w:top w:val="nil"/>
-                <w:left w:val="nil"/>
-                <w:bottom w:val="nil"/>
-                <w:right w:val="nil"/>
-                <w:between w:val="nil"/>
-              </w:pBdr>
-              <w:jc w:val="right"/>
-              <w:rPr>
-                <w:rFonts w:ascii="STIX Two Text" w:eastAsia="STIX Two Text" w:hAnsi="STIX Two Text" w:cs="STIX Two Text"/>
                 <w:i/>
-                <w:color w:val="000000"/>
-              </w:rPr>
-            </w:pPr>
-            <w:r>
-              <w:rPr>
-                <w:rFonts w:ascii="STIX Two Text" w:eastAsia="STIX Two Text" w:hAnsi="STIX Two Text" w:cs="STIX Two Text"/>
-                <w:b/>
-              </w:rPr>
-              <w:t>Cali</w:t>
-            </w:r>
-            <w:r>
-              <w:rPr>
-                <w:rFonts w:ascii="STIX Two Text" w:eastAsia="STIX Two Text" w:hAnsi="STIX Two Text" w:cs="STIX Two Text"/>
-                <w:b/>
-                <w:color w:val="000000"/>
-              </w:rPr>
-              <w:t xml:space="preserve">, </w:t>
-            </w:r>
-            <w:r>
-              <w:rPr>
-                <w:rFonts w:ascii="STIX Two Text" w:eastAsia="STIX Two Text" w:hAnsi="STIX Two Text" w:cs="STIX Two Text"/>
-                <w:b/>
-              </w:rPr>
-              <w:t>Colombia</w:t>
-            </w:r>
+              </w:rPr>
+            </w:pPr>
             <w:r>
               <w:rPr>
                 <w:rFonts w:ascii="STIX Two Text" w:eastAsia="STIX Two Text" w:hAnsi="STIX Two Text" w:cs="STIX Two Text"/>
                 <w:i/>
                 <w:color w:val="000000"/>
               </w:rPr>
-              <w:t xml:space="preserve"> </w:t>
-            </w:r>
-          </w:p>
-          <w:p>
-            <w:pPr>
-              <w:pBdr>
-                <w:top w:val="nil"/>
-                <w:left w:val="nil"/>
-                <w:bottom w:val="nil"/>
-                <w:right w:val="nil"/>
-                <w:between w:val="nil"/>
-              </w:pBdr>
-              <w:jc w:val="right"/>
+              <w:t>A</w:t>
+            </w:r>
+            <w:r>
               <w:rPr>
                 <w:rFonts w:ascii="STIX Two Text" w:eastAsia="STIX Two Text" w:hAnsi="STIX Two Text" w:cs="STIX Two Text"/>
                 <w:i/>
               </w:rPr>
-            </w:pPr>
+              <w:t>bril</w:t>
+            </w:r>
             <w:r>
               <w:rPr>
                 <w:rFonts w:ascii="STIX Two Text" w:eastAsia="STIX Two Text" w:hAnsi="STIX Two Text" w:cs="STIX Two Text"/>
                 <w:i/>
                 <w:color w:val="000000"/>
               </w:rPr>
-              <w:t>A</w:t>
+              <w:t xml:space="preserve"> 20</w:t>
             </w:r>
             <w:r>
               <w:rPr>
                 <w:rFonts w:ascii="STIX Two Text" w:eastAsia="STIX Two Text" w:hAnsi="STIX Two Text" w:cs="STIX Two Text"/>
                 <w:i/>
               </w:rPr>
-              <w:t>bril</w:t>
+              <w:t>24</w:t>
             </w:r>
             <w:r>
               <w:rPr>
@@ -891,29 +1161,21 @@
                 <w:i/>
                 <w:color w:val="000000"/>
               </w:rPr>
-              <w:t xml:space="preserve"> 20</w:t>
+              <w:t>-</w:t>
             </w:r>
             <w:r>
               <w:rPr>
                 <w:rFonts w:ascii="STIX Two Text" w:eastAsia="STIX Two Text" w:hAnsi="STIX Two Text" w:cs="STIX Two Text"/>
                 <w:i/>
               </w:rPr>
-              <w:t>24</w:t>
+              <w:t>septiembre</w:t>
             </w:r>
             <w:r>
               <w:rPr>
                 <w:rFonts w:ascii="STIX Two Text" w:eastAsia="STIX Two Text" w:hAnsi="STIX Two Text" w:cs="STIX Two Text"/>
                 <w:i/>
-                <w:color w:val="000000"/>
-              </w:rPr>
-              <w:t>-</w:t>
-            </w:r>
-            <w:r>
-              <w:rPr>
-                <w:rFonts w:ascii="STIX Two Text" w:eastAsia="STIX Two Text" w:hAnsi="STIX Two Text" w:cs="STIX Two Text"/>
-                <w:i/>
-              </w:rPr>
-              <w:t>Septiembre 2024</w:t>
+              </w:rPr>
+              <w:t xml:space="preserve"> 2024</w:t>
             </w:r>
           </w:p>
           <w:p>
@@ -988,18 +1250,51 @@
             <w:r>
               <w:rPr>
                 <w:rFonts w:ascii="STIX Two Text" w:eastAsia="STIX Two Text" w:hAnsi="STIX Two Text" w:cs="STIX Two Text"/>
-              </w:rPr>
-              <w:t>Participe en el proceso de migración de aplicaciones Java a contenedores Docker y servidores Linux, manejando bases de datos Oracle y utilizando sistemas de control de versiones como Git.</w:t>
-            </w:r>
-          </w:p>
-          <w:p>
-            <w:pPr>
+                <w:color w:val="000000"/>
+              </w:rPr>
+              <w:t>Gestionar y apoyar en el proceso de migración de aplicaciones Java a despliegue mediante contenedores Docker y servidores Linux con el fin de optimizar recursos tecnológicos y sobrecostos.</w:t>
+            </w:r>
+          </w:p>
+          <w:p>
+            <w:pPr>
+              <w:spacing w:after="60"/>
+              <w:ind w:left="641" w:right="851"/>
+              <w:jc w:val="both"/>
+              <w:rPr>
+                <w:rFonts w:ascii="STIX Two Text" w:eastAsia="STIX Two Text" w:hAnsi="STIX Two Text" w:cs="STIX Two Text"/>
+                <w:color w:val="000000"/>
+              </w:rPr>
+            </w:pPr>
+          </w:p>
+          <w:p>
+            <w:pPr>
+              <w:spacing w:after="60"/>
+              <w:ind w:left="641" w:right="851"/>
+              <w:jc w:val="both"/>
+              <w:rPr>
+                <w:rFonts w:ascii="STIX Two Text" w:eastAsia="STIX Two Text" w:hAnsi="STIX Two Text" w:cs="STIX Two Text"/>
+                <w:b/>
+                <w:bCs/>
+              </w:rPr>
+            </w:pPr>
+            <w:r>
+              <w:rPr>
+                <w:rFonts w:ascii="STIX Two Text" w:eastAsia="STIX Two Text" w:hAnsi="STIX Two Text" w:cs="STIX Two Text"/>
+                <w:b/>
+                <w:bCs/>
+              </w:rPr>
+              <w:t>Logros.</w:t>
+            </w:r>
+          </w:p>
+          <w:p>
+            <w:pPr>
+              <w:pStyle w:val="Prrafodelista"/>
               <w:numPr>
                 <w:ilvl w:val="0"/>
-                <w:numId w:val="3"/>
+                <w:numId w:val="5"/>
               </w:numPr>
               <w:spacing w:after="60"/>
-              <w:ind w:left="641" w:right="851" w:hanging="357"/>
+              <w:ind w:right="851"/>
               <w:jc w:val="both"/>
               <w:rPr>
                 <w:rFonts w:ascii="STIX Two Text" w:eastAsia="STIX Two Text" w:hAnsi="STIX Two Text" w:cs="STIX Two Text"/>
@@ -1009,8 +1304,60 @@
             <w:r>
               <w:rPr>
                 <w:rFonts w:ascii="STIX Two Text" w:eastAsia="STIX Two Text" w:hAnsi="STIX Two Text" w:cs="STIX Two Text"/>
-              </w:rPr>
-              <w:t>Colabore en soluciones empresariales con Power Apps conectándose mediante flujos con Power Automate con el fin de automatizar procesos que se hacían manualmente.</w:t>
+                <w:color w:val="000000"/>
+              </w:rPr>
+              <w:t xml:space="preserve">Migrar completamente </w:t>
+            </w:r>
+            <w:r>
+              <w:rPr>
+                <w:rFonts w:ascii="STIX Two Text" w:eastAsia="STIX Two Text" w:hAnsi="STIX Two Text" w:cs="STIX Two Text"/>
+                <w:color w:val="000000"/>
+              </w:rPr>
+              <w:t>3 sistemas críticos y vitales para los servicios que ofrece la institución y dejar las bases para más de 10 sistemas que necesitaban análisis, refactorización y pruebas para permitir manejar su despliegue de la misma forma.</w:t>
+            </w:r>
+          </w:p>
+          <w:p>
+            <w:pPr>
+              <w:pStyle w:val="Prrafodelista"/>
+              <w:numPr>
+                <w:ilvl w:val="0"/>
+                <w:numId w:val="5"/>
+              </w:numPr>
+              <w:spacing w:after="60"/>
+              <w:ind w:right="851"/>
+              <w:jc w:val="both"/>
+              <w:rPr>
+                <w:rFonts w:ascii="STIX Two Text" w:eastAsia="STIX Two Text" w:hAnsi="STIX Two Text" w:cs="STIX Two Text"/>
+                <w:color w:val="000000"/>
+              </w:rPr>
+            </w:pPr>
+            <w:r>
+              <w:rPr>
+                <w:rFonts w:ascii="STIX Two Text" w:eastAsia="STIX Two Text" w:hAnsi="STIX Two Text" w:cs="STIX Two Text"/>
+                <w:color w:val="000000"/>
+              </w:rPr>
+              <w:t xml:space="preserve">Colaborar en </w:t>
+            </w:r>
+            <w:r>
+              <w:rPr>
+                <w:rFonts w:ascii="STIX Two Text" w:eastAsia="STIX Two Text" w:hAnsi="STIX Two Text" w:cs="STIX Two Text"/>
+                <w:color w:val="000000"/>
+              </w:rPr>
+              <w:t xml:space="preserve">la automatización de </w:t>
+            </w:r>
+            <w:r>
+              <w:rPr>
+                <w:rFonts w:ascii="STIX Two Text" w:eastAsia="STIX Two Text" w:hAnsi="STIX Two Text" w:cs="STIX Two Text"/>
+                <w:color w:val="000000"/>
+              </w:rPr>
+              <w:t xml:space="preserve">soluciones empresariales con </w:t>
+            </w:r>
+            <w:r>
+              <w:rPr>
+                <w:rFonts w:ascii="STIX Two Text" w:eastAsia="STIX Two Text" w:hAnsi="STIX Two Text" w:cs="STIX Two Text"/>
+                <w:color w:val="000000"/>
+              </w:rPr>
+              <w:t>tecnologías Low Code.</w:t>
             </w:r>
           </w:p>
         </w:tc>
@@ -1031,6 +1378,13 @@
               </w:rPr>
             </w:pPr>
           </w:p>
+          <w:p>
+            <w:pPr>
+              <w:rPr>
+                <w:rFonts w:ascii="STIX Two Text" w:eastAsia="STIX Two Text" w:hAnsi="STIX Two Text" w:cs="STIX Two Text"/>
+              </w:rPr>
+            </w:pPr>
+          </w:p>
         </w:tc>
       </w:tr>
       <w:tr>
@@ -1160,7 +1514,19 @@
               <w:rPr>
                 <w:rFonts w:ascii="STIX Two Text" w:eastAsia="STIX Two Text" w:hAnsi="STIX Two Text" w:cs="STIX Two Text"/>
               </w:rPr>
-              <w:t>Desempeñe funciones de atención al cliente mediante un centro de atención telefónica en el área de registro ácademico, proporcionando orientación y soporte a la comunidad universitaria en procesos académicos y administrativos.</w:t>
+              <w:t xml:space="preserve">Desempeñe funciones de atención al cliente mediante un centro de atención telefónica en el área de registro </w:t>
+            </w:r>
+            <w:r>
+              <w:rPr>
+                <w:rFonts w:ascii="STIX Two Text" w:eastAsia="STIX Two Text" w:hAnsi="STIX Two Text" w:cs="STIX Two Text"/>
+              </w:rPr>
+              <w:t>académico</w:t>
+            </w:r>
+            <w:r>
+              <w:rPr>
+                <w:rFonts w:ascii="STIX Two Text" w:eastAsia="STIX Two Text" w:hAnsi="STIX Two Text" w:cs="STIX Two Text"/>
+              </w:rPr>
+              <w:t>, proporcionando orientación y soporte a la comunidad universitaria en procesos académicos y administrativos.</w:t>
             </w:r>
           </w:p>
           <w:p>
@@ -1186,51 +1552,6 @@
               </w:rPr>
               <w:t>Apoye la gestión de archivos académicos, organizando y manteniendo la documentación actualizada utilizando herramienta de ofimática.</w:t>
             </w:r>
-          </w:p>
-          <w:p>
-            <w:pPr>
-              <w:spacing w:after="60"/>
-              <w:ind w:left="720"/>
-              <w:rPr>
-                <w:rFonts w:ascii="STIX Two Text" w:eastAsia="STIX Two Text" w:hAnsi="STIX Two Text" w:cs="STIX Two Text"/>
-              </w:rPr>
-            </w:pPr>
-          </w:p>
-          <w:p>
-            <w:pPr>
-              <w:spacing w:after="60"/>
-              <w:ind w:left="720"/>
-              <w:rPr>
-                <w:rFonts w:ascii="STIX Two Text" w:eastAsia="STIX Two Text" w:hAnsi="STIX Two Text" w:cs="STIX Two Text"/>
-              </w:rPr>
-            </w:pPr>
-          </w:p>
-          <w:p>
-            <w:pPr>
-              <w:spacing w:after="60"/>
-              <w:ind w:left="720"/>
-              <w:rPr>
-                <w:rFonts w:ascii="STIX Two Text" w:eastAsia="STIX Two Text" w:hAnsi="STIX Two Text" w:cs="STIX Two Text"/>
-              </w:rPr>
-            </w:pPr>
-          </w:p>
-          <w:p>
-            <w:pPr>
-              <w:spacing w:after="60"/>
-              <w:ind w:left="720"/>
-              <w:rPr>
-                <w:rFonts w:ascii="STIX Two Text" w:eastAsia="STIX Two Text" w:hAnsi="STIX Two Text" w:cs="STIX Two Text"/>
-              </w:rPr>
-            </w:pPr>
-          </w:p>
-          <w:p>
-            <w:pPr>
-              <w:spacing w:after="60"/>
-              <w:ind w:left="720"/>
-              <w:rPr>
-                <w:rFonts w:ascii="STIX Two Text" w:eastAsia="STIX Two Text" w:hAnsi="STIX Two Text" w:cs="STIX Two Text"/>
-              </w:rPr>
-            </w:pPr>
           </w:p>
         </w:tc>
       </w:tr>
@@ -1745,7 +2066,25 @@
               <w:rPr>
                 <w:rFonts w:ascii="STIX Two Text" w:eastAsia="STIX Two Text" w:hAnsi="STIX Two Text" w:cs="STIX Two Text"/>
               </w:rPr>
-              <w:t>Español nativo · Inglés B1</w:t>
+              <w:t xml:space="preserve">Español nativo · </w:t>
+            </w:r>
+            <w:r>
+              <w:rPr>
+                <w:rFonts w:ascii="STIX Two Text" w:eastAsia="STIX Two Text" w:hAnsi="STIX Two Text" w:cs="STIX Two Text"/>
+              </w:rPr>
+              <w:t>inglés</w:t>
+            </w:r>
+            <w:r>
+              <w:rPr>
+                <w:rFonts w:ascii="STIX Two Text" w:eastAsia="STIX Two Text" w:hAnsi="STIX Two Text" w:cs="STIX Two Text"/>
+              </w:rPr>
+              <w:t xml:space="preserve"> B1</w:t>
+            </w:r>
+            <w:r>
+              <w:rPr>
+                <w:rFonts w:ascii="STIX Two Text" w:eastAsia="STIX Two Text" w:hAnsi="STIX Two Text" w:cs="STIX Two Text"/>
+              </w:rPr>
+              <w:t>.</w:t>
             </w:r>
           </w:p>
           <w:p>
@@ -1767,15 +2106,49 @@
               <w:rPr>
                 <w:rFonts w:ascii="STIX Two Text" w:eastAsia="STIX Two Text" w:hAnsi="STIX Two Text" w:cs="STIX Two Text"/>
                 <w:color w:val="000000"/>
-                <w:sz w:val="20"/>
-                <w:szCs w:val="20"/>
-              </w:rPr>
-            </w:pPr>
-            <w:r>
-              <w:rPr>
-                <w:rFonts w:ascii="STIX Two Text" w:eastAsia="STIX Two Text" w:hAnsi="STIX Two Text" w:cs="STIX Two Text"/>
-              </w:rPr>
-              <w:t>Conocimientos en lenguaje de programación Java Web (SE · EE), como aplicado a desarrollo de dispositivos móviles, nociones básicas Spring Framework.</w:t>
+              </w:rPr>
+            </w:pPr>
+            <w:r>
+              <w:rPr>
+                <w:rFonts w:ascii="STIX Two Text" w:eastAsia="STIX Two Text" w:hAnsi="STIX Two Text" w:cs="STIX Two Text"/>
+                <w:color w:val="000000"/>
+              </w:rPr>
+              <w:t>Lenguajes de Programación</w:t>
+            </w:r>
+            <w:r>
+              <w:rPr>
+                <w:rFonts w:ascii="STIX Two Text" w:eastAsia="STIX Two Text" w:hAnsi="STIX Two Text" w:cs="STIX Two Text"/>
+                <w:color w:val="000000"/>
+              </w:rPr>
+              <w:t xml:space="preserve"> y de Consulta</w:t>
+            </w:r>
+            <w:r>
+              <w:rPr>
+                <w:rFonts w:ascii="STIX Two Text" w:eastAsia="STIX Two Text" w:hAnsi="STIX Two Text" w:cs="STIX Two Text"/>
+                <w:color w:val="000000"/>
+              </w:rPr>
+              <w:t>: Java (SE / EE), Kotlin</w:t>
+            </w:r>
+            <w:r>
+              <w:rPr>
+                <w:rFonts w:ascii="STIX Two Text" w:eastAsia="STIX Two Text" w:hAnsi="STIX Two Text" w:cs="STIX Two Text"/>
+                <w:color w:val="000000"/>
+              </w:rPr>
+              <w:t xml:space="preserve"> </w:t>
+            </w:r>
+            <w:r>
+              <w:rPr>
+                <w:rFonts w:ascii="STIX Two Text" w:eastAsia="STIX Two Text" w:hAnsi="STIX Two Text" w:cs="STIX Two Text"/>
+                <w:color w:val="000000"/>
+              </w:rPr>
+              <w:t>y SQL</w:t>
+            </w:r>
+            <w:r>
+              <w:rPr>
+                <w:rFonts w:ascii="STIX Two Text" w:eastAsia="STIX Two Text" w:hAnsi="STIX Two Text" w:cs="STIX Two Text"/>
+                <w:color w:val="000000"/>
+              </w:rPr>
+              <w:t>.</w:t>
             </w:r>
           </w:p>
           <w:p>
@@ -1797,15 +2170,32 @@
               <w:rPr>
                 <w:rFonts w:ascii="STIX Two Text" w:eastAsia="STIX Two Text" w:hAnsi="STIX Two Text" w:cs="STIX Two Text"/>
                 <w:color w:val="000000"/>
-                <w:sz w:val="20"/>
-                <w:szCs w:val="20"/>
-              </w:rPr>
-            </w:pPr>
-            <w:r>
-              <w:rPr>
-                <w:rFonts w:ascii="STIX Two Text" w:eastAsia="STIX Two Text" w:hAnsi="STIX Two Text" w:cs="STIX Two Text"/>
-              </w:rPr>
-              <w:t>Manejo de sistemas de control de versiones con Git, y de servicios de alojamiento en la nube para repositorios como lo son GitHub y GitLab.</w:t>
+                <w:lang w:val="en-US"/>
+              </w:rPr>
+            </w:pPr>
+            <w:r>
+              <w:rPr>
+                <w:rFonts w:ascii="STIX Two Text" w:eastAsia="STIX Two Text" w:hAnsi="STIX Two Text" w:cs="STIX Two Text"/>
+                <w:color w:val="000000"/>
+                <w:lang w:val="en-US"/>
+              </w:rPr>
+              <w:t xml:space="preserve">Desarrollo Web &amp; Frontend: </w:t>
+            </w:r>
+            <w:r>
+              <w:rPr>
+                <w:rFonts w:ascii="STIX Two Text" w:eastAsia="STIX Two Text" w:hAnsi="STIX Two Text" w:cs="STIX Two Text"/>
+                <w:color w:val="000000"/>
+                <w:lang w:val="en-US"/>
+              </w:rPr>
+              <w:t xml:space="preserve">Angular, </w:t>
+            </w:r>
+            <w:r>
+              <w:rPr>
+                <w:rFonts w:ascii="STIX Two Text" w:eastAsia="STIX Two Text" w:hAnsi="STIX Two Text" w:cs="STIX Two Text"/>
+                <w:color w:val="000000"/>
+                <w:lang w:val="en-US"/>
+              </w:rPr>
+              <w:t>Astro, Tailwind CSS</w:t>
             </w:r>
           </w:p>
           <w:p>
@@ -1827,15 +2217,32 @@
               <w:rPr>
                 <w:rFonts w:ascii="STIX Two Text" w:eastAsia="STIX Two Text" w:hAnsi="STIX Two Text" w:cs="STIX Two Text"/>
                 <w:color w:val="000000"/>
-                <w:sz w:val="20"/>
-                <w:szCs w:val="20"/>
-              </w:rPr>
-            </w:pPr>
-            <w:r>
-              <w:rPr>
-                <w:rFonts w:ascii="STIX Two Text" w:eastAsia="STIX Two Text" w:hAnsi="STIX Two Text" w:cs="STIX Two Text"/>
-              </w:rPr>
-              <w:t>Interacción con herramientas de diseño UI/UX y prototipado de software como Figma.</w:t>
+                <w:lang w:val="en-US"/>
+              </w:rPr>
+            </w:pPr>
+            <w:r>
+              <w:rPr>
+                <w:rFonts w:ascii="STIX Two Text" w:eastAsia="STIX Two Text" w:hAnsi="STIX Two Text" w:cs="STIX Two Text"/>
+                <w:color w:val="000000"/>
+                <w:lang w:val="en-US"/>
+              </w:rPr>
+              <w:t>Frameworks &amp; Backend: Spring Framework</w:t>
+            </w:r>
+            <w:r>
+              <w:rPr>
+                <w:rFonts w:ascii="STIX Two Text" w:eastAsia="STIX Two Text" w:hAnsi="STIX Two Text" w:cs="STIX Two Text"/>
+                <w:color w:val="000000"/>
+                <w:lang w:val="en-US"/>
+              </w:rPr>
+              <w:t>, Node JS</w:t>
+            </w:r>
+            <w:r>
+              <w:rPr>
+                <w:rFonts w:ascii="STIX Two Text" w:eastAsia="STIX Two Text" w:hAnsi="STIX Two Text" w:cs="STIX Two Text"/>
+                <w:color w:val="000000"/>
+                <w:lang w:val="en-US"/>
+              </w:rPr>
+              <w:t>.</w:t>
             </w:r>
           </w:p>
           <w:p>
@@ -1864,20 +2271,28 @@
                 <w:rFonts w:ascii="STIX Two Text" w:eastAsia="STIX Two Text" w:hAnsi="STIX Two Text" w:cs="STIX Two Text"/>
                 <w:color w:val="000000"/>
               </w:rPr>
-              <w:t xml:space="preserve">Habilidades e interés en desarrollo de aplicaciones móviles nativas o multiplataforma, con familiaridad y destreza en lenguaje de programación Kotlin y conocimiento </w:t>
-            </w:r>
-            <w:r>
-              <w:rPr>
-                <w:rFonts w:ascii="STIX Two Text" w:eastAsia="STIX Two Text" w:hAnsi="STIX Two Text" w:cs="STIX Two Text"/>
-              </w:rPr>
-              <w:t>práctico</w:t>
-            </w:r>
-            <w:r>
-              <w:rPr>
-                <w:rFonts w:ascii="STIX Two Text" w:eastAsia="STIX Two Text" w:hAnsi="STIX Two Text" w:cs="STIX Two Text"/>
-                <w:color w:val="000000"/>
-              </w:rPr>
-              <w:t xml:space="preserve"> con Frameworks como Flutter o Ionic.</w:t>
+              <w:t xml:space="preserve">Desarrollo </w:t>
+            </w:r>
+            <w:r>
+              <w:rPr>
+                <w:rFonts w:ascii="STIX Two Text" w:eastAsia="STIX Two Text" w:hAnsi="STIX Two Text" w:cs="STIX Two Text"/>
+                <w:color w:val="000000"/>
+              </w:rPr>
+              <w:t>Movil</w:t>
+            </w:r>
+            <w:r>
+              <w:rPr>
+                <w:rFonts w:ascii="STIX Two Text" w:eastAsia="STIX Two Text" w:hAnsi="STIX Two Text" w:cs="STIX Two Text"/>
+                <w:color w:val="000000"/>
+              </w:rPr>
+              <w:t xml:space="preserve">: Android </w:t>
+            </w:r>
+            <w:r>
+              <w:rPr>
+                <w:rFonts w:ascii="STIX Two Text" w:eastAsia="STIX Two Text" w:hAnsi="STIX Two Text" w:cs="STIX Two Text"/>
+                <w:color w:val="000000"/>
+              </w:rPr>
+              <w:t>Nativo.</w:t>
             </w:r>
           </w:p>
           <w:p>
@@ -1906,46 +2321,7 @@
                 <w:rFonts w:ascii="STIX Two Text" w:eastAsia="STIX Two Text" w:hAnsi="STIX Two Text" w:cs="STIX Two Text"/>
                 <w:color w:val="000000"/>
               </w:rPr>
-              <w:t xml:space="preserve">Conocimiento en desarrollo de aplicaciones web con librerías como React y Frameworks de </w:t>
-            </w:r>
-            <w:r>
-              <w:rPr>
-                <w:rFonts w:ascii="STIX Two Text" w:eastAsia="STIX Two Text" w:hAnsi="STIX Two Text" w:cs="STIX Two Text"/>
-              </w:rPr>
-              <w:t>maquetado</w:t>
-            </w:r>
-            <w:r>
-              <w:rPr>
-                <w:rFonts w:ascii="STIX Two Text" w:eastAsia="STIX Two Text" w:hAnsi="STIX Two Text" w:cs="STIX Two Text"/>
-                <w:color w:val="000000"/>
-              </w:rPr>
-              <w:t xml:space="preserve"> co</w:t>
-            </w:r>
-            <w:r>
-              <w:rPr>
-                <w:rFonts w:ascii="STIX Two Text" w:eastAsia="STIX Two Text" w:hAnsi="STIX Two Text" w:cs="STIX Two Text"/>
-              </w:rPr>
-              <w:t>mo</w:t>
-            </w:r>
-            <w:r>
-              <w:rPr>
-                <w:rFonts w:ascii="STIX Two Text" w:eastAsia="STIX Two Text" w:hAnsi="STIX Two Text" w:cs="STIX Two Text"/>
-                <w:color w:val="000000"/>
-              </w:rPr>
-              <w:t xml:space="preserve"> </w:t>
-            </w:r>
-            <w:r>
-              <w:rPr>
-                <w:rFonts w:ascii="STIX Two Text" w:eastAsia="STIX Two Text" w:hAnsi="STIX Two Text" w:cs="STIX Two Text"/>
-              </w:rPr>
-              <w:t>Tailwind Css</w:t>
-            </w:r>
-            <w:r>
-              <w:rPr>
-                <w:rFonts w:ascii="STIX Two Text" w:eastAsia="STIX Two Text" w:hAnsi="STIX Two Text" w:cs="STIX Two Text"/>
-                <w:color w:val="000000"/>
-              </w:rPr>
-              <w:t>.</w:t>
+              <w:t>Bases de Datos: Oracle Database, PostgreSQL, MongoDB.</w:t>
             </w:r>
           </w:p>
           <w:p>
@@ -1974,8 +2350,104 @@
                 <w:rFonts w:ascii="STIX Two Text" w:eastAsia="STIX Two Text" w:hAnsi="STIX Two Text" w:cs="STIX Two Text"/>
                 <w:color w:val="000000"/>
               </w:rPr>
-              <w:t xml:space="preserve"> Manejo de lenguaje de consulta SQL con base de datos relacionales como Oracle Database y PostgreSQL, y bases de datos no relacionales como MongoDB.</w:t>
-            </w:r>
+              <w:t>Herramientas: Git, Figma (UI/UX)</w:t>
+            </w:r>
+            <w:r>
+              <w:rPr>
+                <w:rFonts w:ascii="STIX Two Text" w:eastAsia="STIX Two Text" w:hAnsi="STIX Two Text" w:cs="STIX Two Text"/>
+                <w:color w:val="000000"/>
+              </w:rPr>
+              <w:t>, Docker</w:t>
+            </w:r>
+            <w:r>
+              <w:rPr>
+                <w:rFonts w:ascii="STIX Two Text" w:eastAsia="STIX Two Text" w:hAnsi="STIX Two Text" w:cs="STIX Two Text"/>
+                <w:color w:val="000000"/>
+              </w:rPr>
+              <w:t>.</w:t>
+            </w:r>
+          </w:p>
+          <w:p>
+            <w:pPr>
+              <w:numPr>
+                <w:ilvl w:val="0"/>
+                <w:numId w:val="2"/>
+              </w:numPr>
+              <w:pBdr>
+                <w:top w:val="nil"/>
+                <w:left w:val="nil"/>
+                <w:bottom w:val="nil"/>
+                <w:right w:val="nil"/>
+                <w:between w:val="nil"/>
+              </w:pBdr>
+              <w:spacing w:after="60" w:line="259" w:lineRule="auto"/>
+              <w:ind w:left="641" w:hanging="357"/>
+              <w:jc w:val="both"/>
+              <w:rPr>
+                <w:rFonts w:ascii="STIX Two Text" w:eastAsia="STIX Two Text" w:hAnsi="STIX Two Text" w:cs="STIX Two Text"/>
+                <w:color w:val="000000"/>
+              </w:rPr>
+            </w:pPr>
+            <w:r>
+              <w:rPr>
+                <w:rFonts w:ascii="STIX Two Text" w:eastAsia="STIX Two Text" w:hAnsi="STIX Two Text" w:cs="STIX Two Text"/>
+                <w:color w:val="000000"/>
+              </w:rPr>
+              <w:t>Intereses Técnicos: DevOps</w:t>
+            </w:r>
+            <w:r>
+              <w:rPr>
+                <w:rFonts w:ascii="STIX Two Text" w:eastAsia="STIX Two Text" w:hAnsi="STIX Two Text" w:cs="STIX Two Text"/>
+                <w:color w:val="000000"/>
+              </w:rPr>
+              <w:t xml:space="preserve">, desarrollo móvil con </w:t>
+            </w:r>
+            <w:r>
+              <w:rPr>
+                <w:rFonts w:ascii="STIX Two Text" w:eastAsia="STIX Two Text" w:hAnsi="STIX Two Text" w:cs="STIX Two Text"/>
+                <w:color w:val="000000"/>
+              </w:rPr>
+              <w:t>Swift</w:t>
+            </w:r>
+            <w:r>
+              <w:rPr>
+                <w:rFonts w:ascii="STIX Two Text" w:eastAsia="STIX Two Text" w:hAnsi="STIX Two Text" w:cs="STIX Two Text"/>
+                <w:color w:val="000000"/>
+              </w:rPr>
+              <w:t>/</w:t>
+            </w:r>
+            <w:r>
+              <w:rPr>
+                <w:rFonts w:ascii="STIX Two Text" w:eastAsia="STIX Two Text" w:hAnsi="STIX Two Text" w:cs="STIX Two Text"/>
+                <w:color w:val="000000"/>
+              </w:rPr>
+              <w:t>Flutter</w:t>
+            </w:r>
+            <w:r>
+              <w:rPr>
+                <w:rFonts w:ascii="STIX Two Text" w:eastAsia="STIX Two Text" w:hAnsi="STIX Two Text" w:cs="STIX Two Text"/>
+                <w:color w:val="000000"/>
+              </w:rPr>
+              <w:t>.</w:t>
+            </w:r>
+          </w:p>
+          <w:p>
+            <w:pPr>
+              <w:pBdr>
+                <w:top w:val="nil"/>
+                <w:left w:val="nil"/>
+                <w:bottom w:val="nil"/>
+                <w:right w:val="nil"/>
+                <w:between w:val="nil"/>
+              </w:pBdr>
+              <w:spacing w:after="60" w:line="259" w:lineRule="auto"/>
+              <w:ind w:left="284"/>
+              <w:jc w:val="both"/>
+              <w:rPr>
+                <w:rFonts w:ascii="STIX Two Text" w:eastAsia="STIX Two Text" w:hAnsi="STIX Two Text" w:cs="STIX Two Text"/>
+                <w:color w:val="000000"/>
+              </w:rPr>
+            </w:pPr>
           </w:p>
         </w:tc>
       </w:tr>
@@ -2576,6 +3048,232 @@
       </w:rPr>
     </w:lvl>
   </w:abstractNum>
+  <w:abstractNum w:abstractNumId="3" w15:restartNumberingAfterBreak="0">
+    <w:nsid w:val="69C57275"/>
+    <w:multiLevelType w:val="hybridMultilevel"/>
+    <w:tmpl w:val="D9B6BCD0"/>
+    <w:lvl w:ilvl="0" w:tplc="240A0001">
+      <w:start w:val="1"/>
+      <w:numFmt w:val="bullet"/>
+      <w:lvlText w:val=""/>
+      <w:lvlJc w:val="left"/>
+      <w:pPr>
+        <w:ind w:left="1361" w:hanging="360"/>
+      </w:pPr>
+      <w:rPr>
+        <w:rFonts w:ascii="Symbol" w:hAnsi="Symbol" w:hint="default"/>
+      </w:rPr>
+    </w:lvl>
+    <w:lvl w:ilvl="1" w:tplc="240A0003" w:tentative="1">
+      <w:start w:val="1"/>
+      <w:numFmt w:val="bullet"/>
+      <w:lvlText w:val="o"/>
+      <w:lvlJc w:val="left"/>
+      <w:pPr>
+        <w:ind w:left="2081" w:hanging="360"/>
+      </w:pPr>
+      <w:rPr>
+        <w:rFonts w:ascii="Courier New" w:hAnsi="Courier New" w:cs="Courier New" w:hint="default"/>
+      </w:rPr>
+    </w:lvl>
+    <w:lvl w:ilvl="2" w:tplc="240A0005" w:tentative="1">
+      <w:start w:val="1"/>
+      <w:numFmt w:val="bullet"/>
+      <w:lvlText w:val=""/>
+      <w:lvlJc w:val="left"/>
+      <w:pPr>
+        <w:ind w:left="2801" w:hanging="360"/>
+      </w:pPr>
+      <w:rPr>
+        <w:rFonts w:ascii="Wingdings" w:hAnsi="Wingdings" w:hint="default"/>
+      </w:rPr>
+    </w:lvl>
+    <w:lvl w:ilvl="3" w:tplc="240A0001" w:tentative="1">
+      <w:start w:val="1"/>
+      <w:numFmt w:val="bullet"/>
+      <w:lvlText w:val=""/>
+      <w:lvlJc w:val="left"/>
+      <w:pPr>
+        <w:ind w:left="3521" w:hanging="360"/>
+      </w:pPr>
+      <w:rPr>
+        <w:rFonts w:ascii="Symbol" w:hAnsi="Symbol" w:hint="default"/>
+      </w:rPr>
+    </w:lvl>
+    <w:lvl w:ilvl="4" w:tplc="240A0003" w:tentative="1">
+      <w:start w:val="1"/>
+      <w:numFmt w:val="bullet"/>
+      <w:lvlText w:val="o"/>
+      <w:lvlJc w:val="left"/>
+      <w:pPr>
+        <w:ind w:left="4241" w:hanging="360"/>
+      </w:pPr>
+      <w:rPr>
+        <w:rFonts w:ascii="Courier New" w:hAnsi="Courier New" w:cs="Courier New" w:hint="default"/>
+      </w:rPr>
+    </w:lvl>
+    <w:lvl w:ilvl="5" w:tplc="240A0005" w:tentative="1">
+      <w:start w:val="1"/>
+      <w:numFmt w:val="bullet"/>
+      <w:lvlText w:val=""/>
+      <w:lvlJc w:val="left"/>
+      <w:pPr>
+        <w:ind w:left="4961" w:hanging="360"/>
+      </w:pPr>
+      <w:rPr>
+        <w:rFonts w:ascii="Wingdings" w:hAnsi="Wingdings" w:hint="default"/>
+      </w:rPr>
+    </w:lvl>
+    <w:lvl w:ilvl="6" w:tplc="240A0001" w:tentative="1">
+      <w:start w:val="1"/>
+      <w:numFmt w:val="bullet"/>
+      <w:lvlText w:val=""/>
+      <w:lvlJc w:val="left"/>
+      <w:pPr>
+        <w:ind w:left="5681" w:hanging="360"/>
+      </w:pPr>
+      <w:rPr>
+        <w:rFonts w:ascii="Symbol" w:hAnsi="Symbol" w:hint="default"/>
+      </w:rPr>
+    </w:lvl>
+    <w:lvl w:ilvl="7" w:tplc="240A0003" w:tentative="1">
+      <w:start w:val="1"/>
+      <w:numFmt w:val="bullet"/>
+      <w:lvlText w:val="o"/>
+      <w:lvlJc w:val="left"/>
+      <w:pPr>
+        <w:ind w:left="6401" w:hanging="360"/>
+      </w:pPr>
+      <w:rPr>
+        <w:rFonts w:ascii="Courier New" w:hAnsi="Courier New" w:cs="Courier New" w:hint="default"/>
+      </w:rPr>
+    </w:lvl>
+    <w:lvl w:ilvl="8" w:tplc="240A0005" w:tentative="1">
+      <w:start w:val="1"/>
+      <w:numFmt w:val="bullet"/>
+      <w:lvlText w:val=""/>
+      <w:lvlJc w:val="left"/>
+      <w:pPr>
+        <w:ind w:left="7121" w:hanging="360"/>
+      </w:pPr>
+      <w:rPr>
+        <w:rFonts w:ascii="Wingdings" w:hAnsi="Wingdings" w:hint="default"/>
+      </w:rPr>
+    </w:lvl>
+  </w:abstractNum>
+  <w:abstractNum w:abstractNumId="4" w15:restartNumberingAfterBreak="0">
+    <w:nsid w:val="74B75F91"/>
+    <w:multiLevelType w:val="hybridMultilevel"/>
+    <w:tmpl w:val="10DC065C"/>
+    <w:lvl w:ilvl="0" w:tplc="240A0001">
+      <w:start w:val="1"/>
+      <w:numFmt w:val="bullet"/>
+      <w:lvlText w:val=""/>
+      <w:lvlJc w:val="left"/>
+      <w:pPr>
+        <w:ind w:left="1361" w:hanging="360"/>
+      </w:pPr>
+      <w:rPr>
+        <w:rFonts w:ascii="Symbol" w:hAnsi="Symbol" w:hint="default"/>
+      </w:rPr>
+    </w:lvl>
+    <w:lvl w:ilvl="1" w:tplc="240A0003" w:tentative="1">
+      <w:start w:val="1"/>
+      <w:numFmt w:val="bullet"/>
+      <w:lvlText w:val="o"/>
+      <w:lvlJc w:val="left"/>
+      <w:pPr>
+        <w:ind w:left="2081" w:hanging="360"/>
+      </w:pPr>
+      <w:rPr>
+        <w:rFonts w:ascii="Courier New" w:hAnsi="Courier New" w:cs="Courier New" w:hint="default"/>
+      </w:rPr>
+    </w:lvl>
+    <w:lvl w:ilvl="2" w:tplc="240A0005" w:tentative="1">
+      <w:start w:val="1"/>
+      <w:numFmt w:val="bullet"/>
+      <w:lvlText w:val=""/>
+      <w:lvlJc w:val="left"/>
+      <w:pPr>
+        <w:ind w:left="2801" w:hanging="360"/>
+      </w:pPr>
+      <w:rPr>
+        <w:rFonts w:ascii="Wingdings" w:hAnsi="Wingdings" w:hint="default"/>
+      </w:rPr>
+    </w:lvl>
+    <w:lvl w:ilvl="3" w:tplc="240A0001" w:tentative="1">
+      <w:start w:val="1"/>
+      <w:numFmt w:val="bullet"/>
+      <w:lvlText w:val=""/>
+      <w:lvlJc w:val="left"/>
+      <w:pPr>
+        <w:ind w:left="3521" w:hanging="360"/>
+      </w:pPr>
+      <w:rPr>
+        <w:rFonts w:ascii="Symbol" w:hAnsi="Symbol" w:hint="default"/>
+      </w:rPr>
+    </w:lvl>
+    <w:lvl w:ilvl="4" w:tplc="240A0003" w:tentative="1">
+      <w:start w:val="1"/>
+      <w:numFmt w:val="bullet"/>
+      <w:lvlText w:val="o"/>
+      <w:lvlJc w:val="left"/>
+      <w:pPr>
+        <w:ind w:left="4241" w:hanging="360"/>
+      </w:pPr>
+      <w:rPr>
+        <w:rFonts w:ascii="Courier New" w:hAnsi="Courier New" w:cs="Courier New" w:hint="default"/>
+      </w:rPr>
+    </w:lvl>
+    <w:lvl w:ilvl="5" w:tplc="240A0005" w:tentative="1">
+      <w:start w:val="1"/>
+      <w:numFmt w:val="bullet"/>
+      <w:lvlText w:val=""/>
+      <w:lvlJc w:val="left"/>
+      <w:pPr>
+        <w:ind w:left="4961" w:hanging="360"/>
+      </w:pPr>
+      <w:rPr>
+        <w:rFonts w:ascii="Wingdings" w:hAnsi="Wingdings" w:hint="default"/>
+      </w:rPr>
+    </w:lvl>
+    <w:lvl w:ilvl="6" w:tplc="240A0001" w:tentative="1">
+      <w:start w:val="1"/>
+      <w:numFmt w:val="bullet"/>
+      <w:lvlText w:val=""/>
+      <w:lvlJc w:val="left"/>
+      <w:pPr>
+        <w:ind w:left="5681" w:hanging="360"/>
+      </w:pPr>
+      <w:rPr>
+        <w:rFonts w:ascii="Symbol" w:hAnsi="Symbol" w:hint="default"/>
+      </w:rPr>
+    </w:lvl>
+    <w:lvl w:ilvl="7" w:tplc="240A0003" w:tentative="1">
+      <w:start w:val="1"/>
+      <w:numFmt w:val="bullet"/>
+      <w:lvlText w:val="o"/>
+      <w:lvlJc w:val="left"/>
+      <w:pPr>
+        <w:ind w:left="6401" w:hanging="360"/>
+      </w:pPr>
+      <w:rPr>
+        <w:rFonts w:ascii="Courier New" w:hAnsi="Courier New" w:cs="Courier New" w:hint="default"/>
+      </w:rPr>
+    </w:lvl>
+    <w:lvl w:ilvl="8" w:tplc="240A0005" w:tentative="1">
+      <w:start w:val="1"/>
+      <w:numFmt w:val="bullet"/>
+      <w:lvlText w:val=""/>
+      <w:lvlJc w:val="left"/>
+      <w:pPr>
+        <w:ind w:left="7121" w:hanging="360"/>
+      </w:pPr>
+      <w:rPr>
+        <w:rFonts w:ascii="Wingdings" w:hAnsi="Wingdings" w:hint="default"/>
+      </w:rPr>
+    </w:lvl>
+  </w:abstractNum>
   <w:num w:numId="1" w16cid:durableId="1940138596">
     <w:abstractNumId w:val="2"/>
   </w:num>
@@ -2584,6 +3282,12 @@
   </w:num>
   <w:num w:numId="3" w16cid:durableId="870801732">
     <w:abstractNumId w:val="0"/>
+  </w:num>
+  <w:num w:numId="4" w16cid:durableId="1979528501">
+    <w:abstractNumId w:val="3"/>
+  </w:num>
+  <w:num w:numId="5" w16cid:durableId="1498374646">
+    <w:abstractNumId w:val="4"/>
   </w:num>
 </w:numbering>
 </file>
@@ -2986,6 +3690,7 @@
   <w:style w:type="paragraph" w:default="1" w:styleId="Normal">
     <w:name w:val="Normal"/>
     <w:qFormat/>
+    <w:rsid w:val="00713548"/>
   </w:style>
   <w:style w:type="paragraph" w:styleId="Ttulo1">
     <w:name w:val="heading 1"/>
@@ -3106,7 +3811,6 @@
   <w:style w:type="character" w:default="1" w:styleId="Fuentedeprrafopredeter">
     <w:name w:val="Default Paragraph Font"/>
     <w:uiPriority w:val="1"/>
-    <w:semiHidden/>
     <w:unhideWhenUsed/>
   </w:style>
   <w:style w:type="table" w:default="1" w:styleId="Tablanormal">

</xml_diff>